<commit_message>
Add interim images for articles EC-011 to EC-020
Fill the 30 required cover and body images (1536x1024 plus 600x400 web
versions) from existing site photos so the articles can enter the publication
queue now. Alt text and captions are rewritten to describe the actual photos;
the exact prompts for custom images stay in each article's images folder and
the files can be replaced later under the same names.

Co-Authored-By: Claude Opus 5.5 <noreply@anthropic.com>
</commit_message>
<xml_diff>
--- a/deliverables/Persian_SEO_Publication_Queue/EC-011-dnc-چیست/EC-011-dnc-چیست.docx
+++ b/deliverables/Persian_SEO_Publication_Queue/EC-011-dnc-چیست/EC-011-dnc-چیست.docx
@@ -682,7 +682,7 @@
         </w:rPr>
         <w:t xml:space="preserve">•  </w:t>
       </w:r>
-      <w:hyperlink w:history="1" r:id="rIdurtgeb9mu2kvpggi0iyzj">
+      <w:hyperlink w:history="1" r:id="rIddxsabwqc709cme7lhpnuu">
         <w:r>
           <w:rPr>
             <w:rStyle w:val="Hyperlink"/>
@@ -712,7 +712,7 @@
         </w:rPr>
         <w:t xml:space="preserve">•  </w:t>
       </w:r>
-      <w:hyperlink w:history="1" r:id="rIdbhxkh2b-ym-l4kceppkey">
+      <w:hyperlink w:history="1" r:id="rIdikrqswp294l8naznhzzw6">
         <w:r>
           <w:rPr>
             <w:rStyle w:val="Hyperlink"/>
@@ -742,7 +742,7 @@
         </w:rPr>
         <w:t xml:space="preserve">•  </w:t>
       </w:r>
-      <w:hyperlink w:history="1" r:id="rIdog2u5ppykhknp3gkchmaj">
+      <w:hyperlink w:history="1" r:id="rIdudegvw3yp2-3n9c1u2nlp">
         <w:r>
           <w:rPr>
             <w:rStyle w:val="Hyperlink"/>
@@ -772,7 +772,7 @@
         </w:rPr>
         <w:t xml:space="preserve">•  </w:t>
       </w:r>
-      <w:hyperlink w:history="1" r:id="rIdo_opznxoqpq8w8791spxy">
+      <w:hyperlink w:history="1" r:id="rIdmuxdfwolobypkftyrptdj">
         <w:r>
           <w:rPr>
             <w:rStyle w:val="Hyperlink"/>
@@ -802,7 +802,7 @@
         </w:rPr>
         <w:t xml:space="preserve">•  </w:t>
       </w:r>
-      <w:hyperlink w:history="1" r:id="rIdrrq8uqwafwgvi2pwa2sqa">
+      <w:hyperlink w:history="1" r:id="rIdd8mjqtnmon5anuzui6lq8">
         <w:r>
           <w:rPr>
             <w:rStyle w:val="Hyperlink"/>
@@ -852,7 +852,7 @@
         </w:rPr>
         <w:t xml:space="preserve">•  </w:t>
       </w:r>
-      <w:hyperlink w:history="1" r:id="rIdxx7w3wpg000fw-od348c5">
+      <w:hyperlink w:history="1" r:id="rIdpjukiw38jjp8_bbnv9iok">
         <w:r>
           <w:rPr>
             <w:rStyle w:val="Hyperlink"/>
@@ -882,7 +882,7 @@
         </w:rPr>
         <w:t xml:space="preserve">•  </w:t>
       </w:r>
-      <w:hyperlink w:history="1" r:id="rIdb-6k6vkjcxwovc8ioex8k">
+      <w:hyperlink w:history="1" r:id="rId44qtpko2ecwwbk5ymyoo4">
         <w:r>
           <w:rPr>
             <w:rStyle w:val="Hyperlink"/>
@@ -1161,7 +1161,7 @@
         </w:rPr>
         <w:t xml:space="preserve">برای آشنایی با ساختار خود برنامه‌ها، </w:t>
       </w:r>
-      <w:hyperlink w:history="1" r:id="rId-ypfmo4mmpvsk-n-snzmv">
+      <w:hyperlink w:history="1" r:id="rId8qkkbapikzgm-bbabgokm">
         <w:r>
           <w:rPr>
             <w:rStyle w:val="Hyperlink"/>
@@ -1916,7 +1916,7 @@
         </w:rPr>
         <w:t xml:space="preserve">به بیان ساده، دستگاه CNC بدون DNC هم کار می‌کند؛ اما هرچه تعداد دستگاه‌ها، تنوع کنترلرها و حجم برنامه‌ها بیشتر شود، نبود یک روش کنترل‌شده برای انتقال برنامه هزینه‌های بیشتری ایجاد می‌کند. اگر با ساختار خود دستگاه آشنا نیستید، </w:t>
       </w:r>
-      <w:hyperlink w:history="1" r:id="rIdxypggodw8o5_bbzokzydb">
+      <w:hyperlink w:history="1" r:id="rIdu_4_bnqqnea_ij7nqok0f">
         <w:r>
           <w:rPr>
             <w:rStyle w:val="Hyperlink"/>
@@ -2114,7 +2114,7 @@
         </w:rPr>
         <w:t xml:space="preserve">برای یک نمونه عملی از این تنظیمات، </w:t>
       </w:r>
-      <w:hyperlink w:history="1" r:id="rId4y6wbypuzhrarsjxmyvh8">
+      <w:hyperlink w:history="1" r:id="rIdsoksi7bnqkce1xtzzsuan">
         <w:r>
           <w:rPr>
             <w:rStyle w:val="Hyperlink"/>
@@ -3618,7 +3618,7 @@
         </w:rPr>
         <w:t xml:space="preserve">این مقایسه به این معنا نیست که USB همیشه اشتباه است؛ بلکه یعنی هرچه تعداد دستگاه‌ها و برنامه‌ها بیشتر شود، هزینه پنهان روش دستی بالاتر می‌رود. برای مقایسه کامل روش‌های انتقال، </w:t>
       </w:r>
-      <w:hyperlink w:history="1" r:id="rId1lxhvpayjc7v6_-7j9k0u">
+      <w:hyperlink w:history="1" r:id="rIddxzljmgzwx6ig8yq9trll">
         <w:r>
           <w:rPr>
             <w:rStyle w:val="Hyperlink"/>
@@ -3816,7 +3816,7 @@
         </w:rPr>
         <w:t xml:space="preserve">برای اینکه برنامه‌ها و پارامترها در صورت خرابی از دست نروند، </w:t>
       </w:r>
-      <w:hyperlink w:history="1" r:id="rIdipjicj0syyqlshsa6rle8">
+      <w:hyperlink w:history="1" r:id="rIdzjc8qpdsw-atsy_krbdp3">
         <w:r>
           <w:rPr>
             <w:rStyle w:val="Hyperlink"/>
@@ -4661,7 +4661,7 @@
         </w:rPr>
         <w:t xml:space="preserve">اگر می‌خواهید بدانید یک راهکار DNC بی‌سیم چگونه این معیارها را پوشش می‌دهد، </w:t>
       </w:r>
-      <w:hyperlink w:history="1" r:id="rId-t7jeq6zswrnapbx7ic8p">
+      <w:hyperlink w:history="1" r:id="rIdvn-n4huvpgrqdpp_ni9nh">
         <w:r>
           <w:rPr>
             <w:rStyle w:val="Hyperlink"/>
@@ -4683,7 +4683,7 @@
         </w:rPr>
         <w:t xml:space="preserve"> را ببینید و سازگاری آن را با کنترلر دستگاه‌های خود بررسی کنید. دفترچه‌های رسمی کنترلرها را هم می‌توانید در </w:t>
       </w:r>
-      <w:hyperlink w:history="1" r:id="rIdavqdvmfpzznnrkt1jy1lq">
+      <w:hyperlink w:history="1" r:id="rId1d5oghyy8rtxvff6u0zcz">
         <w:r>
           <w:rPr>
             <w:rStyle w:val="Hyperlink"/>
@@ -5169,7 +5169,7 @@
         </w:rPr>
         <w:t xml:space="preserve">برای شروع، فهرست کنترلرها و روش ارتباطی هر دستگاه را تهیه کنید، یک مرجع مرکزی برای برنامه‌های تأییدشده بسازید و راهکاری انتخاب کنید که با دستگاه‌های قدیمی و جدید شما سازگار باشد. اگر برای بررسی سازگاری به کمک نیاز دارید، از طریق </w:t>
       </w:r>
-      <w:hyperlink w:history="1" r:id="rIdsedrwbclxuvn8ue4q5paf">
+      <w:hyperlink w:history="1" r:id="rIdf9zehibkup6wcbtyaiai_">
         <w:r>
           <w:rPr>
             <w:rStyle w:val="Hyperlink"/>

</xml_diff>